<commit_message>
Shorten abstract to under 150 words
</commit_message>
<xml_diff>
--- a/revision/06a_title_page.docx
+++ b/revision/06a_title_page.docx
@@ -115,7 +115,7 @@
         <w:t xml:space="preserve"> </w:t>
       </w:r>
       <w:r>
-        <w:t xml:space="preserve">7,878 words, including abstract, tables, figure caption, references and declarations (limit 8,000).</w:t>
+        <w:t xml:space="preserve">7,830 words, including abstract, tables, figure caption, references and declarations (limit 8,000).</w:t>
       </w:r>
     </w:p>
     <w:p>
@@ -181,7 +181,7 @@
           <w:bCs/>
           <w:b/>
         </w:rPr>
-        <w:t xml:space="preserve">Abstract (196 words):</w:t>
+        <w:t xml:space="preserve">Abstract (147 words):</w:t>
       </w:r>
       <w:r>
         <w:t xml:space="preserve"> </w:t>

</xml_diff>